<commit_message>
fix(pages): yuktai start page and 404 page
</commit_message>
<xml_diff>
--- a/YuktAI_Developer_Guide_v5.3.4.docx
+++ b/YuktAI_Developer_Guide_v5.3.4.docx
@@ -3055,160 +3055,6 @@
           </w:p>
         </w:tc>
       </w:tr>
-      <w:tr>
-        <w:tc>
-          <w:tcPr>
-            <w:tcW w:type="dxa" w:w="3000"/>
-            <w:tcBorders>
-              <w:top w:val="single" w:color="BFC5CD" w:sz="4"/>
-              <w:left w:val="single" w:color="BFC5CD" w:sz="4"/>
-              <w:bottom w:val="single" w:color="BFC5CD" w:sz="4"/>
-              <w:right w:val="single" w:color="BFC5CD" w:sz="4"/>
-            </w:tcBorders>
-            <w:tcMar>
-              <w:top w:type="dxa" w:w="50"/>
-              <w:left w:type="dxa" w:w="100"/>
-              <w:bottom w:type="dxa" w:w="50"/>
-              <w:right w:type="dxa" w:w="100"/>
-            </w:tcMar>
-          </w:tcPr>
-          <w:p>
-            <w:r>
-              <w:rPr>
-                <w:rFonts w:ascii="Calibri" w:cs="Nirmala UI" w:hAnsi="Calibri"/>
-              </w:rPr>
-              <w:t xml:space="preserve">Vajasaneya Sandhya</w:t>
-            </w:r>
-          </w:p>
-        </w:tc>
-        <w:tc>
-          <w:tcPr>
-            <w:tcW w:type="dxa" w:w="3000"/>
-            <w:tcBorders>
-              <w:top w:val="single" w:color="BFC5CD" w:sz="4"/>
-              <w:left w:val="single" w:color="BFC5CD" w:sz="4"/>
-              <w:bottom w:val="single" w:color="BFC5CD" w:sz="4"/>
-              <w:right w:val="single" w:color="BFC5CD" w:sz="4"/>
-            </w:tcBorders>
-            <w:tcMar>
-              <w:top w:type="dxa" w:w="50"/>
-              <w:left w:type="dxa" w:w="100"/>
-              <w:bottom w:type="dxa" w:w="50"/>
-              <w:right w:type="dxa" w:w="100"/>
-            </w:tcMar>
-          </w:tcPr>
-          <w:p>
-            <w:r>
-              <w:rPr>
-                <w:rFonts w:ascii="Calibri" w:cs="Nirmala UI" w:hAnsi="Calibri"/>
-              </w:rPr>
-              <w:t xml:space="preserve">272 Material, Lucide and react-icons imports</w:t>
-            </w:r>
-          </w:p>
-        </w:tc>
-        <w:tc>
-          <w:tcPr>
-            <w:tcW w:type="dxa" w:w="4224"/>
-            <w:tcBorders>
-              <w:top w:val="single" w:color="BFC5CD" w:sz="4"/>
-              <w:left w:val="single" w:color="BFC5CD" w:sz="4"/>
-              <w:bottom w:val="single" w:color="BFC5CD" w:sz="4"/>
-              <w:right w:val="single" w:color="BFC5CD" w:sz="4"/>
-            </w:tcBorders>
-            <w:tcMar>
-              <w:top w:type="dxa" w:w="50"/>
-              <w:left w:type="dxa" w:w="100"/>
-              <w:bottom w:type="dxa" w:w="50"/>
-              <w:right w:type="dxa" w:w="100"/>
-            </w:tcMar>
-          </w:tcPr>
-          <w:p>
-            <w:r>
-              <w:rPr>
-                <w:rFonts w:ascii="Calibri" w:cs="Nirmala UI" w:hAnsi="Calibri"/>
-              </w:rPr>
-              <w:t xml:space="preserve">100% yuktai icons</w:t>
-            </w:r>
-          </w:p>
-        </w:tc>
-      </w:tr>
-      <w:tr>
-        <w:tc>
-          <w:tcPr>
-            <w:tcW w:type="dxa" w:w="3000"/>
-            <w:tcBorders>
-              <w:top w:val="single" w:color="BFC5CD" w:sz="4"/>
-              <w:left w:val="single" w:color="BFC5CD" w:sz="4"/>
-              <w:bottom w:val="single" w:color="BFC5CD" w:sz="4"/>
-              <w:right w:val="single" w:color="BFC5CD" w:sz="4"/>
-            </w:tcBorders>
-            <w:tcMar>
-              <w:top w:type="dxa" w:w="50"/>
-              <w:left w:type="dxa" w:w="100"/>
-              <w:bottom w:type="dxa" w:w="50"/>
-              <w:right w:type="dxa" w:w="100"/>
-            </w:tcMar>
-          </w:tcPr>
-          <w:p>
-            <w:r>
-              <w:rPr>
-                <w:rFonts w:ascii="Calibri" w:cs="Nirmala UI" w:hAnsi="Calibri"/>
-              </w:rPr>
-              <w:t xml:space="preserve">Sri Yagnavalkya Jayanti</w:t>
-            </w:r>
-          </w:p>
-        </w:tc>
-        <w:tc>
-          <w:tcPr>
-            <w:tcW w:type="dxa" w:w="3000"/>
-            <w:tcBorders>
-              <w:top w:val="single" w:color="BFC5CD" w:sz="4"/>
-              <w:left w:val="single" w:color="BFC5CD" w:sz="4"/>
-              <w:bottom w:val="single" w:color="BFC5CD" w:sz="4"/>
-              <w:right w:val="single" w:color="BFC5CD" w:sz="4"/>
-            </w:tcBorders>
-            <w:tcMar>
-              <w:top w:type="dxa" w:w="50"/>
-              <w:left w:type="dxa" w:w="100"/>
-              <w:bottom w:type="dxa" w:w="50"/>
-              <w:right w:type="dxa" w:w="100"/>
-            </w:tcMar>
-          </w:tcPr>
-          <w:p>
-            <w:r>
-              <w:rPr>
-                <w:rFonts w:ascii="Calibri" w:cs="Nirmala UI" w:hAnsi="Calibri"/>
-              </w:rPr>
-              <w:t xml:space="preserve">86 Material Icons font + 29 Font Awesome</w:t>
-            </w:r>
-          </w:p>
-        </w:tc>
-        <w:tc>
-          <w:tcPr>
-            <w:tcW w:type="dxa" w:w="4224"/>
-            <w:tcBorders>
-              <w:top w:val="single" w:color="BFC5CD" w:sz="4"/>
-              <w:left w:val="single" w:color="BFC5CD" w:sz="4"/>
-              <w:bottom w:val="single" w:color="BFC5CD" w:sz="4"/>
-              <w:right w:val="single" w:color="BFC5CD" w:sz="4"/>
-            </w:tcBorders>
-            <w:tcMar>
-              <w:top w:type="dxa" w:w="50"/>
-              <w:left w:type="dxa" w:w="100"/>
-              <w:bottom w:type="dxa" w:w="50"/>
-              <w:right w:type="dxa" w:w="100"/>
-            </w:tcMar>
-          </w:tcPr>
-          <w:p>
-            <w:r>
-              <w:rPr>
-                <w:rFonts w:ascii="Calibri" w:cs="Nirmala UI" w:hAnsi="Calibri"/>
-              </w:rPr>
-              <w:t xml:space="preserve">100% yuktai icons (plain HTML)</w:t>
-            </w:r>
-          </w:p>
-        </w:tc>
-      </w:tr>
     </w:tbl>
     <w:p>
       <w:pPr>
@@ -3669,6 +3515,58 @@
                 <w:rFonts w:ascii="Calibri" w:cs="Nirmala UI" w:hAnsi="Calibri"/>
               </w:rPr>
               <w:t xml:space="preserve">https://sandeepmiriyala03.github.io/yuktai/vanilla/</w:t>
+            </w:r>
+          </w:p>
+        </w:tc>
+      </w:tr>
+      <w:tr>
+        <w:tc>
+          <w:tcPr>
+            <w:tcW w:type="dxa" w:w="3400"/>
+            <w:tcBorders>
+              <w:top w:val="single" w:color="BFC5CD" w:sz="4"/>
+              <w:left w:val="single" w:color="BFC5CD" w:sz="4"/>
+              <w:bottom w:val="single" w:color="BFC5CD" w:sz="4"/>
+              <w:right w:val="single" w:color="BFC5CD" w:sz="4"/>
+            </w:tcBorders>
+            <w:tcMar>
+              <w:top w:type="dxa" w:w="50"/>
+              <w:left w:type="dxa" w:w="100"/>
+              <w:bottom w:type="dxa" w:w="50"/>
+              <w:right w:type="dxa" w:w="100"/>
+            </w:tcMar>
+          </w:tcPr>
+          <w:p>
+            <w:r>
+              <w:rPr>
+                <w:rFonts w:ascii="Calibri" w:cs="Nirmala UI" w:hAnsi="Calibri"/>
+              </w:rPr>
+              <w:t xml:space="preserve">Start page</w:t>
+            </w:r>
+          </w:p>
+        </w:tc>
+        <w:tc>
+          <w:tcPr>
+            <w:tcW w:type="dxa" w:w="6824"/>
+            <w:tcBorders>
+              <w:top w:val="single" w:color="BFC5CD" w:sz="4"/>
+              <w:left w:val="single" w:color="BFC5CD" w:sz="4"/>
+              <w:bottom w:val="single" w:color="BFC5CD" w:sz="4"/>
+              <w:right w:val="single" w:color="BFC5CD" w:sz="4"/>
+            </w:tcBorders>
+            <w:tcMar>
+              <w:top w:type="dxa" w:w="50"/>
+              <w:left w:type="dxa" w:w="100"/>
+              <w:bottom w:type="dxa" w:w="50"/>
+              <w:right w:type="dxa" w:w="100"/>
+            </w:tcMar>
+          </w:tcPr>
+          <w:p>
+            <w:r>
+              <w:rPr>
+                <w:rFonts w:ascii="Calibri" w:cs="Nirmala UI" w:hAnsi="Calibri"/>
+              </w:rPr>
+              <w:t xml:space="preserve">https://sandeepmiriyala03.github.io/yuktai/</w:t>
             </w:r>
           </w:p>
         </w:tc>

</xml_diff>